<commit_message>
Remove internal audit notes from the repository
Drop the mock-data audit, sandbox requirements, sandbox audit, and verification write-ups, and the README sections that pointed at them. The data-field document no longer includes the prototype-gaps appendix. A sample login in the CIBIL spec is cleared.
</commit_message>
<xml_diff>
--- a/docs/MITRA_Data_Field_Requirements.docx
+++ b/docs/MITRA_Data_Field_Requirements.docx
@@ -391,7 +391,7 @@
                 <w:color w:val="1A1A1A"/>
                 <w:sz w:val="19"/>
               </w:rPr>
-              <w:t>openapi.yaml (machine-readable) · API_CONTRACT.md · SANDBOX_REQUIREMENTS.md</w:t>
+              <w:t>openapi.yaml (machine-readable) · API_CONTRACT.md</w:t>
             </w:r>
           </w:p>
         </w:tc>
@@ -34038,7 +34038,7 @@
           <w:color w:val="5A6363"/>
           <w:sz w:val="19"/>
         </w:rPr>
-        <w:t>Summarised from the accompanying SANDBOX_REQUIREMENTS.md. These are the platform-level conditions for the field specification above to be delivered safely.</w:t>
+        <w:t>Platform-level conditions for the field specification above.</w:t>
       </w:r>
     </w:p>
     <w:p>
@@ -34946,634 +34946,7 @@
           <w:color w:val="006B6B"/>
           <w:sz w:val="34"/>
         </w:rPr>
-        <w:t>15  Appendix A — Prototype Data Gaps</w:t>
-      </w:r>
-    </w:p>
-    <w:p>
-      <w:pPr>
-        <w:spacing w:after="200"/>
-      </w:pPr>
-      <w:r>
-        <w:rPr>
-          <w:color w:val="006B6B"/>
-          <w:sz w:val="12"/>
-        </w:rPr>
-        <w:t>────────────────────────────────────────────────────────────</w:t>
-      </w:r>
-    </w:p>
-    <w:p>
-      <w:pPr>
-        <w:spacing w:after="120"/>
-      </w:pPr>
-      <w:r>
-        <w:rPr>
-          <w:b w:val="0"/>
-          <w:i w:val="0"/>
-          <w:color w:val="1A1A1A"/>
-          <w:sz w:val="20"/>
-        </w:rPr>
-        <w:t>The current MITRA prototype runs entirely in the browser against two hand-authored customer profiles. The advisory calculations are genuine and port to a server unchanged; the data layer around them does not yet accept a live source. This appendix records the gaps that this field specification is intended to close, so reviewers can see what changes and what does not.</w:t>
-      </w:r>
-    </w:p>
-    <w:p>
-      <w:pPr>
-        <w:spacing w:before="240" w:after="80"/>
-      </w:pPr>
-      <w:r>
-        <w:rPr>
-          <w:b/>
-          <w:color w:val="006B6B"/>
-          <w:sz w:val="25"/>
-        </w:rPr>
-        <w:t>15.1  What is already real</w:t>
-      </w:r>
-    </w:p>
-    <w:p>
-      <w:pPr>
-        <w:pStyle w:val="ListBullet"/>
-        <w:spacing w:after="60"/>
-        <w:ind w:left="403"/>
-      </w:pPr>
-      <w:r>
-        <w:rPr>
-          <w:color w:val="1A1A1A"/>
-          <w:sz w:val="20"/>
-        </w:rPr>
-        <w:t>All advisory mathematics — SIP future value, required-instalment solving, loan amortisation, allocation drift, capital-gains harvesting and fee-drag projection.</w:t>
-      </w:r>
-    </w:p>
-    <w:p>
-      <w:pPr>
-        <w:pStyle w:val="ListBullet"/>
-        <w:spacing w:after="60"/>
-        <w:ind w:left="403"/>
-      </w:pPr>
-      <w:r>
-        <w:rPr>
-          <w:color w:val="1A1A1A"/>
-          <w:sz w:val="20"/>
-        </w:rPr>
-        <w:t>CSV statement parsing, transaction categorisation, monthly aggregation and recurring-payment detection.</w:t>
-      </w:r>
-    </w:p>
-    <w:p>
-      <w:pPr>
-        <w:pStyle w:val="ListBullet"/>
-        <w:spacing w:after="60"/>
-        <w:ind w:left="403"/>
-      </w:pPr>
-      <w:r>
-        <w:rPr>
-          <w:color w:val="1A1A1A"/>
-          <w:sz w:val="20"/>
-        </w:rPr>
-        <w:t>A deterministic rule-based advisor that answers without any language model — a genuine resilience property, retained by design.</w:t>
-      </w:r>
-    </w:p>
-    <w:p>
-      <w:pPr>
-        <w:spacing w:before="240" w:after="80"/>
-      </w:pPr>
-      <w:r>
-        <w:rPr>
-          <w:b/>
-          <w:color w:val="006B6B"/>
-          <w:sz w:val="25"/>
-        </w:rPr>
-        <w:t>15.2  What this specification replaces</w:t>
-      </w:r>
-    </w:p>
-    <w:tbl>
-      <w:tblPr>
-        <w:tblStyle w:val="TableGrid"/>
-        <w:tblW w:type="auto" w:w="0"/>
-        <w:tblLayout w:type="fixed"/>
-        <w:tblLook w:firstColumn="1" w:firstRow="1" w:lastColumn="0" w:lastRow="0" w:noHBand="0" w:noVBand="1" w:val="04A0"/>
-      </w:tblPr>
-      <w:tblGrid>
-        <w:gridCol w:w="4704"/>
-        <w:gridCol w:w="4704"/>
-        <w:gridCol w:w="4704"/>
-      </w:tblGrid>
-      <w:tr>
-        <w:trPr>
-          <w:tblHeader w:val="true"/>
-        </w:trPr>
-        <w:tc>
-          <w:tcPr>
-            <w:tcW w:type="dxa" w:w="3299"/>
-            <w:shd w:val="clear" w:color="auto" w:fill="006B6B"/>
-          </w:tcPr>
-          <w:p>
-            <w:pPr>
-              <w:spacing w:after="40" w:before="40" w:line="240" w:lineRule="auto"/>
-            </w:pPr>
-            <w:r/>
-            <w:r>
-              <w:rPr>
-                <w:rFonts w:ascii="Calibri" w:hAnsi="Calibri"/>
-                <w:b/>
-                <w:i w:val="0"/>
-                <w:color w:val="FFFFFF"/>
-                <w:sz w:val="17"/>
-              </w:rPr>
-              <w:t>Prototype behaviour</w:t>
-            </w:r>
-          </w:p>
-        </w:tc>
-        <w:tc>
-          <w:tcPr>
-            <w:tcW w:type="dxa" w:w="5616"/>
-            <w:shd w:val="clear" w:color="auto" w:fill="006B6B"/>
-          </w:tcPr>
-          <w:p>
-            <w:pPr>
-              <w:spacing w:after="40" w:before="40" w:line="240" w:lineRule="auto"/>
-            </w:pPr>
-            <w:r/>
-            <w:r>
-              <w:rPr>
-                <w:rFonts w:ascii="Calibri" w:hAnsi="Calibri"/>
-                <w:b/>
-                <w:i w:val="0"/>
-                <w:color w:val="FFFFFF"/>
-                <w:sz w:val="17"/>
-              </w:rPr>
-              <w:t>Current state</w:t>
-            </w:r>
-          </w:p>
-        </w:tc>
-        <w:tc>
-          <w:tcPr>
-            <w:tcW w:type="dxa" w:w="5125"/>
-            <w:shd w:val="clear" w:color="auto" w:fill="006B6B"/>
-          </w:tcPr>
-          <w:p>
-            <w:pPr>
-              <w:spacing w:after="40" w:before="40" w:line="240" w:lineRule="auto"/>
-            </w:pPr>
-            <w:r/>
-            <w:r>
-              <w:rPr>
-                <w:rFonts w:ascii="Calibri" w:hAnsi="Calibri"/>
-                <w:b/>
-                <w:i w:val="0"/>
-                <w:color w:val="FFFFFF"/>
-                <w:sz w:val="17"/>
-              </w:rPr>
-              <w:t>Replaced by</w:t>
-            </w:r>
-          </w:p>
-        </w:tc>
-      </w:tr>
-      <w:tr>
-        <w:tc>
-          <w:tcPr>
-            <w:tcW w:type="dxa" w:w="3299"/>
-          </w:tcPr>
-          <w:p>
-            <w:pPr>
-              <w:spacing w:after="40" w:before="40" w:line="240" w:lineRule="auto"/>
-            </w:pPr>
-            <w:r/>
-            <w:r>
-              <w:rPr>
-                <w:rFonts w:ascii="Calibri" w:hAnsi="Calibri"/>
-                <w:b w:val="0"/>
-                <w:i w:val="0"/>
-                <w:color w:val="1A1A1A"/>
-                <w:sz w:val="18"/>
-              </w:rPr>
-              <w:t>Simulated account connection</w:t>
-            </w:r>
-          </w:p>
-        </w:tc>
-        <w:tc>
-          <w:tcPr>
-            <w:tcW w:type="dxa" w:w="5616"/>
-          </w:tcPr>
-          <w:p>
-            <w:pPr>
-              <w:spacing w:after="40" w:before="40" w:line="240" w:lineRule="auto"/>
-            </w:pPr>
-            <w:r/>
-            <w:r>
-              <w:rPr>
-                <w:rFonts w:ascii="Calibri" w:hAnsi="Calibri"/>
-                <w:b w:val="0"/>
-                <w:i w:val="0"/>
-                <w:color w:val="1A1A1A"/>
-                <w:sz w:val="18"/>
-              </w:rPr>
-              <w:t>Randomly generated holdings stand in for a broker or aggregator link.</w:t>
-            </w:r>
-          </w:p>
-        </w:tc>
-        <w:tc>
-          <w:tcPr>
-            <w:tcW w:type="dxa" w:w="5125"/>
-          </w:tcPr>
-          <w:p>
-            <w:pPr>
-              <w:spacing w:after="40" w:before="40" w:line="240" w:lineRule="auto"/>
-            </w:pPr>
-            <w:r/>
-            <w:r>
-              <w:rPr>
-                <w:rFonts w:ascii="Calibri" w:hAnsi="Calibri"/>
-                <w:b w:val="0"/>
-                <w:i w:val="0"/>
-                <w:color w:val="1A1A1A"/>
-                <w:sz w:val="18"/>
-              </w:rPr>
-              <w:t>Sections 5–6, sourced via Account Aggregator.</w:t>
-            </w:r>
-          </w:p>
-        </w:tc>
-      </w:tr>
-      <w:tr>
-        <w:tc>
-          <w:tcPr>
-            <w:tcW w:type="dxa" w:w="3299"/>
-            <w:shd w:val="clear" w:color="auto" w:fill="F2F4F4"/>
-          </w:tcPr>
-          <w:p>
-            <w:pPr>
-              <w:spacing w:after="40" w:before="40" w:line="240" w:lineRule="auto"/>
-            </w:pPr>
-            <w:r/>
-            <w:r>
-              <w:rPr>
-                <w:rFonts w:ascii="Calibri" w:hAnsi="Calibri"/>
-                <w:b w:val="0"/>
-                <w:i w:val="0"/>
-                <w:color w:val="1A1A1A"/>
-                <w:sz w:val="18"/>
-              </w:rPr>
-              <w:t>Static market data</w:t>
-            </w:r>
-          </w:p>
-        </w:tc>
-        <w:tc>
-          <w:tcPr>
-            <w:tcW w:type="dxa" w:w="5616"/>
-            <w:shd w:val="clear" w:color="auto" w:fill="F2F4F4"/>
-          </w:tcPr>
-          <w:p>
-            <w:pPr>
-              <w:spacing w:after="40" w:before="40" w:line="240" w:lineRule="auto"/>
-            </w:pPr>
-            <w:r/>
-            <w:r>
-              <w:rPr>
-                <w:rFonts w:ascii="Calibri" w:hAnsi="Calibri"/>
-                <w:b w:val="0"/>
-                <w:i w:val="0"/>
-                <w:color w:val="1A1A1A"/>
-                <w:sz w:val="18"/>
-              </w:rPr>
-              <w:t>A fixed 20-point index series and a fixed headline.</w:t>
-            </w:r>
-          </w:p>
-        </w:tc>
-        <w:tc>
-          <w:tcPr>
-            <w:tcW w:type="dxa" w:w="5125"/>
-            <w:shd w:val="clear" w:color="auto" w:fill="F2F4F4"/>
-          </w:tcPr>
-          <w:p>
-            <w:pPr>
-              <w:spacing w:after="40" w:before="40" w:line="240" w:lineRule="auto"/>
-            </w:pPr>
-            <w:r/>
-            <w:r>
-              <w:rPr>
-                <w:rFonts w:ascii="Calibri" w:hAnsi="Calibri"/>
-                <w:b w:val="0"/>
-                <w:i w:val="0"/>
-                <w:color w:val="1A1A1A"/>
-                <w:sz w:val="18"/>
-              </w:rPr>
-              <w:t>Licensed exchange feed and AMFI NAV file.</w:t>
-            </w:r>
-          </w:p>
-        </w:tc>
-      </w:tr>
-      <w:tr>
-        <w:tc>
-          <w:tcPr>
-            <w:tcW w:type="dxa" w:w="3299"/>
-          </w:tcPr>
-          <w:p>
-            <w:pPr>
-              <w:spacing w:after="40" w:before="40" w:line="240" w:lineRule="auto"/>
-            </w:pPr>
-            <w:r/>
-            <w:r>
-              <w:rPr>
-                <w:rFonts w:ascii="Calibri" w:hAnsi="Calibri"/>
-                <w:b w:val="0"/>
-                <w:i w:val="0"/>
-                <w:color w:val="1A1A1A"/>
-                <w:sz w:val="18"/>
-              </w:rPr>
-              <w:t>Hand-authored peer benchmarks</w:t>
-            </w:r>
-          </w:p>
-        </w:tc>
-        <w:tc>
-          <w:tcPr>
-            <w:tcW w:type="dxa" w:w="5616"/>
-          </w:tcPr>
-          <w:p>
-            <w:pPr>
-              <w:spacing w:after="40" w:before="40" w:line="240" w:lineRule="auto"/>
-            </w:pPr>
-            <w:r/>
-            <w:r>
-              <w:rPr>
-                <w:rFonts w:ascii="Calibri" w:hAnsi="Calibri"/>
-                <w:b w:val="0"/>
-                <w:i w:val="0"/>
-                <w:color w:val="1A1A1A"/>
-                <w:sz w:val="18"/>
-              </w:rPr>
-              <w:t>Cohort percentiles written per persona.</w:t>
-            </w:r>
-          </w:p>
-        </w:tc>
-        <w:tc>
-          <w:tcPr>
-            <w:tcW w:type="dxa" w:w="5125"/>
-          </w:tcPr>
-          <w:p>
-            <w:pPr>
-              <w:spacing w:after="40" w:before="40" w:line="240" w:lineRule="auto"/>
-            </w:pPr>
-            <w:r/>
-            <w:r>
-              <w:rPr>
-                <w:rFonts w:ascii="Calibri" w:hAnsi="Calibri"/>
-                <w:b w:val="0"/>
-                <w:i w:val="0"/>
-                <w:color w:val="1A1A1A"/>
-                <w:sz w:val="18"/>
-              </w:rPr>
-              <w:t>Computed cohort statistics with a minimum cohort size of 1,000 for anonymity.</w:t>
-            </w:r>
-          </w:p>
-        </w:tc>
-      </w:tr>
-      <w:tr>
-        <w:tc>
-          <w:tcPr>
-            <w:tcW w:type="dxa" w:w="3299"/>
-            <w:shd w:val="clear" w:color="auto" w:fill="F2F4F4"/>
-          </w:tcPr>
-          <w:p>
-            <w:pPr>
-              <w:spacing w:after="40" w:before="40" w:line="240" w:lineRule="auto"/>
-            </w:pPr>
-            <w:r/>
-            <w:r>
-              <w:rPr>
-                <w:rFonts w:ascii="Calibri" w:hAnsi="Calibri"/>
-                <w:b w:val="0"/>
-                <w:i w:val="0"/>
-                <w:color w:val="1A1A1A"/>
-                <w:sz w:val="18"/>
-              </w:rPr>
-              <w:t>Embedded assumptions</w:t>
-            </w:r>
-          </w:p>
-        </w:tc>
-        <w:tc>
-          <w:tcPr>
-            <w:tcW w:type="dxa" w:w="5616"/>
-            <w:shd w:val="clear" w:color="auto" w:fill="F2F4F4"/>
-          </w:tcPr>
-          <w:p>
-            <w:pPr>
-              <w:spacing w:after="40" w:before="40" w:line="240" w:lineRule="auto"/>
-            </w:pPr>
-            <w:r/>
-            <w:r>
-              <w:rPr>
-                <w:rFonts w:ascii="Calibri" w:hAnsi="Calibri"/>
-                <w:b w:val="0"/>
-                <w:i w:val="0"/>
-                <w:color w:val="1A1A1A"/>
-                <w:sz w:val="18"/>
-              </w:rPr>
-              <w:t>Emergency-fund target, tax slab, deduction limits and expected returns fixed in code.</w:t>
-            </w:r>
-          </w:p>
-        </w:tc>
-        <w:tc>
-          <w:tcPr>
-            <w:tcW w:type="dxa" w:w="5125"/>
-            <w:shd w:val="clear" w:color="auto" w:fill="F2F4F4"/>
-          </w:tcPr>
-          <w:p>
-            <w:pPr>
-              <w:spacing w:after="40" w:before="40" w:line="240" w:lineRule="auto"/>
-            </w:pPr>
-            <w:r/>
-            <w:r>
-              <w:rPr>
-                <w:rFonts w:ascii="Calibri" w:hAnsi="Calibri"/>
-                <w:b w:val="0"/>
-                <w:i w:val="0"/>
-                <w:color w:val="1A1A1A"/>
-                <w:sz w:val="18"/>
-              </w:rPr>
-              <w:t>Versioned policy parameters returned in assumption_set (Section 12.3).</w:t>
-            </w:r>
-          </w:p>
-        </w:tc>
-      </w:tr>
-      <w:tr>
-        <w:tc>
-          <w:tcPr>
-            <w:tcW w:type="dxa" w:w="3299"/>
-          </w:tcPr>
-          <w:p>
-            <w:pPr>
-              <w:spacing w:after="40" w:before="40" w:line="240" w:lineRule="auto"/>
-            </w:pPr>
-            <w:r/>
-            <w:r>
-              <w:rPr>
-                <w:rFonts w:ascii="Calibri" w:hAnsi="Calibri"/>
-                <w:b w:val="0"/>
-                <w:i w:val="0"/>
-                <w:color w:val="1A1A1A"/>
-                <w:sz w:val="18"/>
-              </w:rPr>
-              <w:t>Client-side credentials</w:t>
-            </w:r>
-          </w:p>
-        </w:tc>
-        <w:tc>
-          <w:tcPr>
-            <w:tcW w:type="dxa" w:w="5616"/>
-          </w:tcPr>
-          <w:p>
-            <w:pPr>
-              <w:spacing w:after="40" w:before="40" w:line="240" w:lineRule="auto"/>
-            </w:pPr>
-            <w:r/>
-            <w:r>
-              <w:rPr>
-                <w:rFonts w:ascii="Calibri" w:hAnsi="Calibri"/>
-                <w:b w:val="0"/>
-                <w:i w:val="0"/>
-                <w:color w:val="1A1A1A"/>
-                <w:sz w:val="18"/>
-              </w:rPr>
-              <w:t>Prototype-only session handling and a language-model key held in the browser.</w:t>
-            </w:r>
-          </w:p>
-        </w:tc>
-        <w:tc>
-          <w:tcPr>
-            <w:tcW w:type="dxa" w:w="5125"/>
-          </w:tcPr>
-          <w:p>
-            <w:pPr>
-              <w:spacing w:after="40" w:before="40" w:line="240" w:lineRule="auto"/>
-            </w:pPr>
-            <w:r/>
-            <w:r>
-              <w:rPr>
-                <w:rFonts w:ascii="Calibri" w:hAnsi="Calibri"/>
-                <w:b w:val="0"/>
-                <w:i w:val="0"/>
-                <w:color w:val="1A1A1A"/>
-                <w:sz w:val="18"/>
-              </w:rPr>
-              <w:t>Server-side identity federation and server-side model invocation.</w:t>
-            </w:r>
-          </w:p>
-        </w:tc>
-      </w:tr>
-      <w:tr>
-        <w:tc>
-          <w:tcPr>
-            <w:tcW w:type="dxa" w:w="3299"/>
-            <w:shd w:val="clear" w:color="auto" w:fill="F2F4F4"/>
-          </w:tcPr>
-          <w:p>
-            <w:pPr>
-              <w:spacing w:after="40" w:before="40" w:line="240" w:lineRule="auto"/>
-            </w:pPr>
-            <w:r/>
-            <w:r>
-              <w:rPr>
-                <w:rFonts w:ascii="Calibri" w:hAnsi="Calibri"/>
-                <w:b w:val="0"/>
-                <w:i w:val="0"/>
-                <w:color w:val="1A1A1A"/>
-                <w:sz w:val="18"/>
-              </w:rPr>
-              <w:t>Silent PDF handling</w:t>
-            </w:r>
-          </w:p>
-        </w:tc>
-        <w:tc>
-          <w:tcPr>
-            <w:tcW w:type="dxa" w:w="5616"/>
-            <w:shd w:val="clear" w:color="auto" w:fill="F2F4F4"/>
-          </w:tcPr>
-          <w:p>
-            <w:pPr>
-              <w:spacing w:after="40" w:before="40" w:line="240" w:lineRule="auto"/>
-            </w:pPr>
-            <w:r/>
-            <w:r>
-              <w:rPr>
-                <w:rFonts w:ascii="Calibri" w:hAnsi="Calibri"/>
-                <w:b w:val="0"/>
-                <w:i w:val="0"/>
-                <w:color w:val="1A1A1A"/>
-                <w:sz w:val="18"/>
-              </w:rPr>
-              <w:t>PDF statement uploads are accepted but not parsed.</w:t>
-            </w:r>
-          </w:p>
-        </w:tc>
-        <w:tc>
-          <w:tcPr>
-            <w:tcW w:type="dxa" w:w="5125"/>
-            <w:shd w:val="clear" w:color="auto" w:fill="F2F4F4"/>
-          </w:tcPr>
-          <w:p>
-            <w:pPr>
-              <w:spacing w:after="40" w:before="40" w:line="240" w:lineRule="auto"/>
-            </w:pPr>
-            <w:r/>
-            <w:r>
-              <w:rPr>
-                <w:rFonts w:ascii="Calibri" w:hAnsi="Calibri"/>
-                <w:b w:val="0"/>
-                <w:i w:val="0"/>
-                <w:color w:val="1A1A1A"/>
-                <w:sz w:val="18"/>
-              </w:rPr>
-              <w:t>Server-side extraction with an explicit per-stage job status.</w:t>
-            </w:r>
-          </w:p>
-        </w:tc>
-      </w:tr>
-    </w:tbl>
-    <w:p>
-      <w:pPr>
-        <w:spacing w:after="40"/>
-      </w:pPr>
-    </w:p>
-    <w:p>
-      <w:pPr>
-        <w:spacing w:before="240" w:after="80"/>
-      </w:pPr>
-      <w:r>
-        <w:rPr>
-          <w:b/>
-          <w:color w:val="006B6B"/>
-          <w:sz w:val="25"/>
-        </w:rPr>
-        <w:t>15.3  Sequencing</w:t>
-      </w:r>
-    </w:p>
-    <w:p>
-      <w:pPr>
-        <w:spacing w:after="120"/>
-      </w:pPr>
-      <w:r>
-        <w:rPr>
-          <w:b w:val="0"/>
-          <w:i w:val="0"/>
-          <w:color w:val="1A1A1A"/>
-          <w:sz w:val="20"/>
-        </w:rPr>
-        <w:t>The field specification does not depend on Account Aggregator onboarding. A synthetic corpus conforming to these field definitions — including a customer holding no investments, which the current prototype does not handle — unblocks the entire build while the aggregator agreement proceeds in parallel.</w:t>
-      </w:r>
-    </w:p>
-    <w:p>
-      <w:r>
-        <w:br w:type="page"/>
-      </w:r>
-    </w:p>
-    <w:p>
-      <w:pPr>
-        <w:spacing w:before="0" w:after="80"/>
-      </w:pPr>
-      <w:r>
-        <w:rPr>
-          <w:b/>
-          <w:color w:val="006B6B"/>
-          <w:sz w:val="34"/>
-        </w:rPr>
-        <w:t>16  Appendix B — Open Points for IDBI</w:t>
+        <w:t>15  Appendix A — Open Points for IDBI</w:t>
       </w:r>
     </w:p>
     <w:p>
@@ -36141,7 +35514,7 @@
                 <w:color w:val="1A1A1A"/>
                 <w:sz w:val="18"/>
               </w:rPr>
-              <w:t>If not, the peer-comparison feature is withdrawn rather than shown against synthetic baselines.</w:t>
+              <w:t>Cohort statistics need a minimum size before a comparison is shown.</w:t>
             </w:r>
           </w:p>
         </w:tc>
@@ -36296,7 +35669,7 @@
                 <w:color w:val="1A1A1A"/>
                 <w:sz w:val="18"/>
               </w:rPr>
-              <w:t>Account Aggregator sandbox, or synthetic corpus only for the first phase?</w:t>
+              <w:t>Account Aggregator sandbox, or a field-shaped corpus for the first phase?</w:t>
             </w:r>
           </w:p>
         </w:tc>
@@ -36317,7 +35690,7 @@
                 <w:color w:val="1A1A1A"/>
                 <w:sz w:val="18"/>
               </w:rPr>
-              <w:t>Recommendation: synthetic first. Aggregator onboarding carries a 4–8 week lead time and should not gate the build.</w:t>
+              <w:t>Either source can feed the same field list.</w:t>
             </w:r>
           </w:p>
         </w:tc>

</xml_diff>